<commit_message>
Read Word Track Changes and comments from .docx drafts
.docx files are now read from their XML so the counterparty's redline
survives: each clause keeps its tracked insertions/deletions (author, date)
and the margin comments on it; whole-clause deletions are recorded. The
redline and comments show on the clause and in its analysis, and the
original-document view renders tracked changes. Redlined clauses are never
auto-accepted; deleted pre-approved clauses are must-change and the email
asks for them back. Acme's demo draft is now a real Track Changes file
with comments and a deleted clause.

Co-Authored-By: Claude Opus 5.5 <noreply@anthropic.com>
</commit_message>
<xml_diff>
--- a/demo/contracts/Acme-Mutual-NDA-redlined.docx
+++ b/demo/contracts/Acme-Mutual-NDA-redlined.docx
@@ -69,8 +69,292 @@
         </w:rPr>
         <w:t xml:space="preserve">1.3 </w:t>
       </w:r>
-      <w:r>
-        <w:t xml:space="preserve">Information shall not be Confidential Information if it: (a) is or becomes public other than as a result of a breach of this Agreement; (b) was already lawfully held by the Recipient prior to disclosure; (c) is lawfully obtained from a third party who is free to disclose it; or (d) is developed independently by the Recipient without reference to the Discloser's Confidential Information.</w:t>
+      <w:del w:id="100" w:author="Acme Legal" w:date="2026-10-12T14:30:00Z">
+        <w:r>
+          <w:delText xml:space="preserve">Confidential</w:delText>
+        </w:r>
+      </w:del>
+      <w:r>
+        <w:t xml:space="preserve"> </w:t>
+      </w:r>
+      <w:r>
+        <w:t xml:space="preserve">Information</w:t>
+      </w:r>
+      <w:r>
+        <w:t xml:space="preserve"> </w:t>
+      </w:r>
+      <w:del w:id="101" w:author="Acme Legal" w:date="2026-10-12T14:30:00Z">
+        <w:r>
+          <w:delText xml:space="preserve">does</w:delText>
+        </w:r>
+      </w:del>
+      <w:r>
+        <w:t xml:space="preserve"> </w:t>
+      </w:r>
+      <w:ins w:id="102" w:author="Acme Legal" w:date="2026-10-12T14:30:00Z">
+        <w:r>
+          <w:t xml:space="preserve">shall</w:t>
+        </w:r>
+      </w:ins>
+      <w:r>
+        <w:t xml:space="preserve"> </w:t>
+      </w:r>
+      <w:r>
+        <w:t xml:space="preserve">not</w:t>
+      </w:r>
+      <w:r>
+        <w:t xml:space="preserve"> </w:t>
+      </w:r>
+      <w:del w:id="103" w:author="Acme Legal" w:date="2026-10-12T14:30:00Z">
+        <w:r>
+          <w:delText xml:space="preserve">include</w:delText>
+        </w:r>
+      </w:del>
+      <w:r>
+        <w:t xml:space="preserve"> </w:t>
+      </w:r>
+      <w:ins w:id="104" w:author="Acme Legal" w:date="2026-10-12T14:30:00Z">
+        <w:r>
+          <w:t xml:space="preserve">be Confidential</w:t>
+        </w:r>
+      </w:ins>
+      <w:r>
+        <w:t xml:space="preserve"> </w:t>
+      </w:r>
+      <w:r>
+        <w:t xml:space="preserve">Information</w:t>
+      </w:r>
+      <w:r>
+        <w:t xml:space="preserve"> </w:t>
+      </w:r>
+      <w:del w:id="105" w:author="Acme Legal" w:date="2026-10-12T14:30:00Z">
+        <w:r>
+          <w:delText xml:space="preserve">that:</w:delText>
+        </w:r>
+      </w:del>
+      <w:r>
+        <w:t xml:space="preserve"> </w:t>
+      </w:r>
+      <w:ins w:id="106" w:author="Acme Legal" w:date="2026-10-12T14:30:00Z">
+        <w:r>
+          <w:t xml:space="preserve">if it:</w:t>
+        </w:r>
+      </w:ins>
+      <w:r>
+        <w:t xml:space="preserve"> </w:t>
+      </w:r>
+      <w:r>
+        <w:t xml:space="preserve">(a) is or becomes</w:t>
+      </w:r>
+      <w:r>
+        <w:t xml:space="preserve"> </w:t>
+      </w:r>
+      <w:del w:id="107" w:author="Acme Legal" w:date="2026-10-12T14:30:00Z">
+        <w:r>
+          <w:delText xml:space="preserve">publicly available</w:delText>
+        </w:r>
+      </w:del>
+      <w:r>
+        <w:t xml:space="preserve"> </w:t>
+      </w:r>
+      <w:ins w:id="108" w:author="Acme Legal" w:date="2026-10-12T14:30:00Z">
+        <w:r>
+          <w:t xml:space="preserve">public</w:t>
+        </w:r>
+      </w:ins>
+      <w:r>
+        <w:t xml:space="preserve"> </w:t>
+      </w:r>
+      <w:r>
+        <w:t xml:space="preserve">other than</w:t>
+      </w:r>
+      <w:r>
+        <w:t xml:space="preserve"> </w:t>
+      </w:r>
+      <w:del w:id="109" w:author="Acme Legal" w:date="2026-10-12T14:30:00Z">
+        <w:r>
+          <w:delText xml:space="preserve">through</w:delText>
+        </w:r>
+      </w:del>
+      <w:r>
+        <w:t xml:space="preserve"> </w:t>
+      </w:r>
+      <w:ins w:id="110" w:author="Acme Legal" w:date="2026-10-12T14:30:00Z">
+        <w:r>
+          <w:t xml:space="preserve">as</w:t>
+        </w:r>
+      </w:ins>
+      <w:r>
+        <w:t xml:space="preserve"> </w:t>
+      </w:r>
+      <w:r>
+        <w:t xml:space="preserve">a</w:t>
+      </w:r>
+      <w:r>
+        <w:t xml:space="preserve"> </w:t>
+      </w:r>
+      <w:ins w:id="111" w:author="Acme Legal" w:date="2026-10-12T14:30:00Z">
+        <w:r>
+          <w:t xml:space="preserve">result of a</w:t>
+        </w:r>
+      </w:ins>
+      <w:r>
+        <w:t xml:space="preserve"> </w:t>
+      </w:r>
+      <w:r>
+        <w:t xml:space="preserve">breach of this Agreement; (b) was</w:t>
+      </w:r>
+      <w:r>
+        <w:t xml:space="preserve"> </w:t>
+      </w:r>
+      <w:ins w:id="112" w:author="Acme Legal" w:date="2026-10-12T14:30:00Z">
+        <w:r>
+          <w:t xml:space="preserve">already</w:t>
+        </w:r>
+      </w:ins>
+      <w:r>
+        <w:t xml:space="preserve"> </w:t>
+      </w:r>
+      <w:r>
+        <w:t xml:space="preserve">lawfully</w:t>
+      </w:r>
+      <w:r>
+        <w:t xml:space="preserve"> </w:t>
+      </w:r>
+      <w:del w:id="113" w:author="Acme Legal" w:date="2026-10-12T14:30:00Z">
+        <w:r>
+          <w:delText xml:space="preserve">in</w:delText>
+        </w:r>
+      </w:del>
+      <w:r>
+        <w:t xml:space="preserve"> </w:t>
+      </w:r>
+      <w:ins w:id="114" w:author="Acme Legal" w:date="2026-10-12T14:30:00Z">
+        <w:r>
+          <w:t xml:space="preserve">held by</w:t>
+        </w:r>
+      </w:ins>
+      <w:r>
+        <w:t xml:space="preserve"> </w:t>
+      </w:r>
+      <w:r>
+        <w:t xml:space="preserve">the</w:t>
+      </w:r>
+      <w:r>
+        <w:t xml:space="preserve"> </w:t>
+      </w:r>
+      <w:del w:id="115" w:author="Acme Legal" w:date="2026-10-12T14:30:00Z">
+        <w:r>
+          <w:delText xml:space="preserve">Recipient's possession before</w:delText>
+        </w:r>
+      </w:del>
+      <w:r>
+        <w:t xml:space="preserve"> </w:t>
+      </w:r>
+      <w:ins w:id="116" w:author="Acme Legal" w:date="2026-10-12T14:30:00Z">
+        <w:r>
+          <w:t xml:space="preserve">Recipient prior to</w:t>
+        </w:r>
+      </w:ins>
+      <w:r>
+        <w:t xml:space="preserve"> </w:t>
+      </w:r>
+      <w:r>
+        <w:t xml:space="preserve">disclosure; (c) is lawfully</w:t>
+      </w:r>
+      <w:r>
+        <w:t xml:space="preserve"> </w:t>
+      </w:r>
+      <w:del w:id="117" w:author="Acme Legal" w:date="2026-10-12T14:30:00Z">
+        <w:r>
+          <w:delText xml:space="preserve">received</w:delText>
+        </w:r>
+      </w:del>
+      <w:r>
+        <w:t xml:space="preserve"> </w:t>
+      </w:r>
+      <w:ins w:id="118" w:author="Acme Legal" w:date="2026-10-12T14:30:00Z">
+        <w:r>
+          <w:t xml:space="preserve">obtained</w:t>
+        </w:r>
+      </w:ins>
+      <w:r>
+        <w:t xml:space="preserve"> </w:t>
+      </w:r>
+      <w:r>
+        <w:t xml:space="preserve">from a third party</w:t>
+      </w:r>
+      <w:r>
+        <w:t xml:space="preserve"> </w:t>
+      </w:r>
+      <w:del w:id="119" w:author="Acme Legal" w:date="2026-10-12T14:30:00Z">
+        <w:r>
+          <w:delText xml:space="preserve">without restriction;</w:delText>
+        </w:r>
+      </w:del>
+      <w:r>
+        <w:t xml:space="preserve"> </w:t>
+      </w:r>
+      <w:ins w:id="120" w:author="Acme Legal" w:date="2026-10-12T14:30:00Z">
+        <w:r>
+          <w:t xml:space="preserve">who is free to disclose it;</w:t>
+        </w:r>
+      </w:ins>
+      <w:r>
+        <w:t xml:space="preserve"> </w:t>
+      </w:r>
+      <w:r>
+        <w:t xml:space="preserve">or (d) is</w:t>
+      </w:r>
+      <w:r>
+        <w:t xml:space="preserve"> </w:t>
+      </w:r>
+      <w:del w:id="121" w:author="Acme Legal" w:date="2026-10-12T14:30:00Z">
+        <w:r>
+          <w:delText xml:space="preserve">independently</w:delText>
+        </w:r>
+      </w:del>
+      <w:r>
+        <w:t xml:space="preserve"> </w:t>
+      </w:r>
+      <w:r>
+        <w:t xml:space="preserve">developed</w:t>
+      </w:r>
+      <w:r>
+        <w:t xml:space="preserve"> </w:t>
+      </w:r>
+      <w:ins w:id="122" w:author="Acme Legal" w:date="2026-10-12T14:30:00Z">
+        <w:r>
+          <w:t xml:space="preserve">independently</w:t>
+        </w:r>
+      </w:ins>
+      <w:r>
+        <w:t xml:space="preserve"> </w:t>
+      </w:r>
+      <w:r>
+        <w:t xml:space="preserve">by the Recipient without</w:t>
+      </w:r>
+      <w:r>
+        <w:t xml:space="preserve"> </w:t>
+      </w:r>
+      <w:del w:id="123" w:author="Acme Legal" w:date="2026-10-12T14:30:00Z">
+        <w:r>
+          <w:delText xml:space="preserve">use of</w:delText>
+        </w:r>
+      </w:del>
+      <w:r>
+        <w:t xml:space="preserve"> </w:t>
+      </w:r>
+      <w:ins w:id="124" w:author="Acme Legal" w:date="2026-10-12T14:30:00Z">
+        <w:r>
+          <w:t xml:space="preserve">reference to</w:t>
+        </w:r>
+      </w:ins>
+      <w:r>
+        <w:t xml:space="preserve"> </w:t>
+      </w:r>
+      <w:r>
+        <w:t xml:space="preserve">the Discloser's Confidential Information.</w:t>
       </w:r>
     </w:p>
     <w:p>
@@ -94,7 +378,21 @@
         <w:t xml:space="preserve">2.1 </w:t>
       </w:r>
       <w:r>
-        <w:t xml:space="preserve">The Recipient shall: (a) keep the Discloser's Confidential Information confidential; (b) use it only for the Purpose; and (c) not disclose it to any person except its and its Affiliates' employees, officers, professional advisers and subcontractors who need to know it for the Purpose and who are bound by confidentiality obligations no less protective than those in this Agreement.</w:t>
+        <w:t xml:space="preserve">The Recipient shall: (a) keep the Discloser's Confidential Information confidential; (b) use it only for the Purpose; and (c) not disclose it to any person except its</w:t>
+      </w:r>
+      <w:r>
+        <w:t xml:space="preserve"> </w:t>
+      </w:r>
+      <w:ins w:id="125" w:author="Acme Legal" w:date="2026-10-12T14:30:00Z">
+        <w:r>
+          <w:t xml:space="preserve">and its Affiliates'</w:t>
+        </w:r>
+      </w:ins>
+      <w:r>
+        <w:t xml:space="preserve"> </w:t>
+      </w:r>
+      <w:r>
+        <w:t xml:space="preserve">employees, officers, professional advisers and subcontractors who need to know it for the Purpose and who are bound by confidentiality obligations no less protective than those in this Agreement.</w:t>
       </w:r>
     </w:p>
     <w:p>
@@ -131,15 +429,15 @@
       <w:pPr>
         <w:spacing w:after="120"/>
       </w:pPr>
-      <w:r>
-        <w:rPr>
-          <w:b/>
-          <w:bCs/>
-        </w:rPr>
-        <w:t xml:space="preserve">2.4 </w:t>
-      </w:r>
-      <w:r>
-        <w:t xml:space="preserve">Notwithstanding clause 2.1, either party shall be free to use for any purpose the Residuals resulting from access to or work with the Confidential Information of the other party. "Residuals" means information in non-tangible form which may be retained in the unaided memory of persons who have had access to the Confidential Information.</w:t>
+      <w:commentRangeStart w:id="0"/>
+      <w:ins w:id="126" w:author="Acme Legal" w:date="2026-10-12T14:30:00Z">
+        <w:r>
+          <w:t xml:space="preserve">2.4 Notwithstanding clause 2.1, either party shall be free to use for any purpose the Residuals resulting from access to or work with the Confidential Information of the other party. "Residuals" means information in non-tangible form which may be retained in the unaided memory of persons who have had access to the Confidential Information.</w:t>
+        </w:r>
+      </w:ins>
+      <w:commentRangeEnd w:id="0"/>
+      <w:r>
+        <w:commentReference w:id="0"/>
       </w:r>
     </w:p>
     <w:p>
@@ -185,16 +483,11 @@
       <w:pPr>
         <w:spacing w:after="120"/>
       </w:pPr>
-      <w:r>
-        <w:rPr>
-          <w:b/>
-          <w:bCs/>
-        </w:rPr>
-        <w:t xml:space="preserve">3.3 </w:t>
-      </w:r>
-      <w:r>
-        <w:t xml:space="preserve">Confidential Information is provided "as is". The Discloser gives no warranty as to its accuracy or completeness.</w:t>
-      </w:r>
+      <w:del w:id="127" w:author="Acme Legal" w:date="2026-10-12T14:30:00Z">
+        <w:r>
+          <w:delText xml:space="preserve">3.3 Confidential Information is provided "as is". The Discloser gives no warranty as to its accuracy or completeness.</w:delText>
+        </w:r>
+      </w:del>
     </w:p>
     <w:p>
       <w:pPr>
@@ -209,6 +502,7 @@
       <w:pPr>
         <w:spacing w:after="120"/>
       </w:pPr>
+      <w:commentRangeStart w:id="1"/>
       <w:r>
         <w:rPr>
           <w:b/>
@@ -217,7 +511,33 @@
         <w:t xml:space="preserve">4.1 </w:t>
       </w:r>
       <w:r>
-        <w:t xml:space="preserve">This Agreement starts on the date of last signature and continues for two (2) years. The obligations in this Agreement shall continue for five (5) years from the date of termination or expiry, except in relation to trade secrets, which shall be protected for as long as they remain trade secrets.</w:t>
+        <w:t xml:space="preserve">This Agreement starts on the date of last signature and continues for two (2) years. The obligations in this Agreement shall continue for</w:t>
+      </w:r>
+      <w:r>
+        <w:t xml:space="preserve"> </w:t>
+      </w:r>
+      <w:del w:id="128" w:author="Acme Legal" w:date="2026-10-12T14:30:00Z">
+        <w:r>
+          <w:delText xml:space="preserve">three (3)</w:delText>
+        </w:r>
+      </w:del>
+      <w:r>
+        <w:t xml:space="preserve"> </w:t>
+      </w:r>
+      <w:ins w:id="129" w:author="Acme Legal" w:date="2026-10-12T14:30:00Z">
+        <w:r>
+          <w:t xml:space="preserve">five (5)</w:t>
+        </w:r>
+      </w:ins>
+      <w:r>
+        <w:t xml:space="preserve"> </w:t>
+      </w:r>
+      <w:r>
+        <w:t xml:space="preserve">years from the date of termination or expiry, except in relation to trade secrets, which shall be protected for as long as they remain trade secrets.</w:t>
+      </w:r>
+      <w:commentRangeEnd w:id="1"/>
+      <w:r>
+        <w:commentReference w:id="1"/>
       </w:r>
     </w:p>
     <w:p>
@@ -225,24 +545,21 @@
         <w:pStyle w:val="Heading2"/>
         <w:spacing w:before="240"/>
       </w:pPr>
-      <w:r>
-        <w:t xml:space="preserve">5. NON-SOLICITATION</w:t>
-      </w:r>
-    </w:p>
-    <w:p>
-      <w:pPr>
-        <w:spacing w:after="120"/>
-      </w:pPr>
-      <w:r>
-        <w:rPr>
-          <w:b/>
-          <w:bCs/>
-        </w:rPr>
-        <w:t xml:space="preserve">5.1 </w:t>
-      </w:r>
-      <w:r>
-        <w:t xml:space="preserve">During the term of this Agreement and for twenty-four (24) months thereafter, PortSwigger shall not directly or indirectly solicit, employ or engage any employee of Acme with whom it has had contact in connection with the Purpose.</w:t>
-      </w:r>
+      <w:ins w:id="130" w:author="Acme Legal" w:date="2026-10-12T14:30:00Z">
+        <w:r>
+          <w:t xml:space="preserve">5. NON-SOLICITATION</w:t>
+        </w:r>
+      </w:ins>
+    </w:p>
+    <w:p>
+      <w:pPr>
+        <w:spacing w:after="120"/>
+      </w:pPr>
+      <w:ins w:id="131" w:author="Acme Legal" w:date="2026-10-12T14:30:00Z">
+        <w:r>
+          <w:t xml:space="preserve">5.1 During the term of this Agreement and for twenty-four (24) months thereafter, PortSwigger shall not directly or indirectly solicit, employ or engage any employee of Acme with whom it has had contact in connection with the Purpose.</w:t>
+        </w:r>
+      </w:ins>
     </w:p>
     <w:p>
       <w:pPr>
@@ -370,8 +687,46 @@
         <w:t xml:space="preserve">6.8 </w:t>
       </w:r>
       <w:r>
-        <w:t xml:space="preserve">This Agreement and any dispute or claim arising out of or in connection with it shall be governed by the laws of the State of New York.</w:t>
-      </w:r>
+        <w:t xml:space="preserve">This Agreement and any dispute or claim arising out of or in connection with it shall be governed by the</w:t>
+      </w:r>
+      <w:r>
+        <w:t xml:space="preserve"> </w:t>
+      </w:r>
+      <w:del w:id="132" w:author="Acme Legal" w:date="2026-10-12T14:30:00Z">
+        <w:r>
+          <w:delText xml:space="preserve">law</w:delText>
+        </w:r>
+      </w:del>
+      <w:r>
+        <w:t xml:space="preserve"> </w:t>
+      </w:r>
+      <w:ins w:id="133" w:author="Acme Legal" w:date="2026-10-12T14:30:00Z">
+        <w:r>
+          <w:t xml:space="preserve">laws</w:t>
+        </w:r>
+      </w:ins>
+      <w:r>
+        <w:t xml:space="preserve"> </w:t>
+      </w:r>
+      <w:r>
+        <w:t xml:space="preserve">of</w:t>
+      </w:r>
+      <w:r>
+        <w:t xml:space="preserve"> </w:t>
+      </w:r>
+      <w:del w:id="134" w:author="Acme Legal" w:date="2026-10-12T14:30:00Z">
+        <w:r>
+          <w:delText xml:space="preserve">England and Wales.</w:delText>
+        </w:r>
+      </w:del>
+      <w:r>
+        <w:t xml:space="preserve"> </w:t>
+      </w:r>
+      <w:ins w:id="135" w:author="Acme Legal" w:date="2026-10-12T14:30:00Z">
+        <w:r>
+          <w:t xml:space="preserve">the State of New York.</w:t>
+        </w:r>
+      </w:ins>
     </w:p>
     <w:p>
       <w:pPr>
@@ -385,7 +740,51 @@
         <w:t xml:space="preserve">6.9 </w:t>
       </w:r>
       <w:r>
-        <w:t xml:space="preserve">The state and federal courts located in New York County, New York shall have exclusive jurisdiction to settle any dispute or claim arising out of or in connection with this Agreement.</w:t>
+        <w:t xml:space="preserve">The</w:t>
+      </w:r>
+      <w:r>
+        <w:t xml:space="preserve"> </w:t>
+      </w:r>
+      <w:del w:id="136" w:author="Acme Legal" w:date="2026-10-12T14:30:00Z">
+        <w:r>
+          <w:delText xml:space="preserve">courts of England</w:delText>
+        </w:r>
+      </w:del>
+      <w:r>
+        <w:t xml:space="preserve"> </w:t>
+      </w:r>
+      <w:ins w:id="137" w:author="Acme Legal" w:date="2026-10-12T14:30:00Z">
+        <w:r>
+          <w:t xml:space="preserve">state</w:t>
+        </w:r>
+      </w:ins>
+      <w:r>
+        <w:t xml:space="preserve"> </w:t>
+      </w:r>
+      <w:r>
+        <w:t xml:space="preserve">and</w:t>
+      </w:r>
+      <w:r>
+        <w:t xml:space="preserve"> </w:t>
+      </w:r>
+      <w:del w:id="138" w:author="Acme Legal" w:date="2026-10-12T14:30:00Z">
+        <w:r>
+          <w:delText xml:space="preserve">Wales</w:delText>
+        </w:r>
+      </w:del>
+      <w:r>
+        <w:t xml:space="preserve"> </w:t>
+      </w:r>
+      <w:ins w:id="139" w:author="Acme Legal" w:date="2026-10-12T14:30:00Z">
+        <w:r>
+          <w:t xml:space="preserve">federal courts located in New York County, New York</w:t>
+        </w:r>
+      </w:ins>
+      <w:r>
+        <w:t xml:space="preserve"> </w:t>
+      </w:r>
+      <w:r>
+        <w:t xml:space="preserve">shall have exclusive jurisdiction to settle any dispute or claim arising out of or in connection with this Agreement.</w:t>
       </w:r>
     </w:p>
     <w:p>
@@ -404,6 +803,25 @@
     </w:sectPr>
   </w:body>
 </w:document>
+</file>
+
+<file path=word/comments.xml><?xml version="1.0" encoding="utf-8"?>
+<w:comments xmlns:wpc="http://schemas.microsoft.com/office/word/2010/wordprocessingCanvas" xmlns:cx="http://schemas.microsoft.com/office/drawing/2014/chartex" xmlns:cx1="http://schemas.microsoft.com/office/drawing/2015/9/8/chartex" xmlns:cx2="http://schemas.microsoft.com/office/drawing/2015/10/21/chartex" xmlns:cx3="http://schemas.microsoft.com/office/drawing/2016/5/9/chartex" xmlns:cx4="http://schemas.microsoft.com/office/drawing/2016/5/10/chartex" xmlns:cx5="http://schemas.microsoft.com/office/drawing/2016/5/11/chartex" xmlns:cx6="http://schemas.microsoft.com/office/drawing/2016/5/12/chartex" xmlns:cx7="http://schemas.microsoft.com/office/drawing/2016/5/13/chartex" xmlns:cx8="http://schemas.microsoft.com/office/drawing/2016/5/14/chartex" xmlns:mc="http://schemas.openxmlformats.org/markup-compatibility/2006" xmlns:aink="http://schemas.microsoft.com/office/drawing/2016/ink" xmlns:am3d="http://schemas.microsoft.com/office/drawing/2017/model3d" xmlns:o="urn:schemas-microsoft-com:office:office" xmlns:r="http://schemas.openxmlformats.org/officeDocument/2006/relationships" xmlns:m="http://schemas.openxmlformats.org/officeDocument/2006/math" xmlns:v="urn:schemas-microsoft-com:vml" xmlns:wp14="http://schemas.microsoft.com/office/word/2010/wordprocessingDrawing" xmlns:wp="http://schemas.openxmlformats.org/drawingml/2006/wordprocessingDrawing" xmlns:w10="urn:schemas-microsoft-com:office:word" xmlns:w="http://schemas.openxmlformats.org/wordprocessingml/2006/main" xmlns:w14="http://schemas.microsoft.com/office/word/2010/wordml" xmlns:w15="http://schemas.microsoft.com/office/word/2012/wordml" xmlns:w16cex="http://schemas.microsoft.com/office/word/2018/wordml/cex" xmlns:w16cid="http://schemas.microsoft.com/office/word/2016/wordml/cid" xmlns:w16="http://schemas.microsoft.com/office/word/2018/wordml" xmlns:w16sdtdh="http://schemas.microsoft.com/office/word/2020/wordml/sdtdatahash" xmlns:w16se="http://schemas.microsoft.com/office/word/2015/wordml/symex" xmlns:wpg="http://schemas.microsoft.com/office/word/2010/wordprocessingGroup" xmlns:wpi="http://schemas.microsoft.com/office/word/2010/wordprocessingInk" xmlns:wne="http://schemas.microsoft.com/office/word/2006/wordml" xmlns:wps="http://schemas.microsoft.com/office/word/2010/wordprocessingShape" mc:Ignorable="w14 w15 wp14">
+  <w:comment w:id="0" w:author="Acme Legal" w:date="2026-10-12T14:30:00.000Z">
+    <w:p>
+      <w:r>
+        <w:t xml:space="preserve">Standard in all Acme NDAs: our engineers cannot unlearn what they have seen.</w:t>
+      </w:r>
+    </w:p>
+  </w:comment>
+  <w:comment w:id="1" w:author="Acme Legal" w:date="2026-10-12T14:30:00.000Z">
+    <w:p>
+      <w:r>
+        <w:t xml:space="preserve">Our board requires a five-year term for all supplier NDAs.</w:t>
+      </w:r>
+    </w:p>
+  </w:comment>
+</w:comments>
 </file>
 
 <file path=word/endnotes.xml><?xml version="1.0" encoding="utf-8"?>

</xml_diff>